<commit_message>
fix(diseño-patrones): menos recuadros con ícono en la OVA U1 y la guía
Co-Authored-By: Claude Opus 5.5 <noreply@anthropic.com>
</commit_message>
<xml_diff>
--- a/2026-B/disenio-patrones-arquitectonicos/proyecto-aula/pdf/Guia-Proyecto-de-Aula.docx
+++ b/2026-B/disenio-patrones-arquitectonicos/proyecto-aula/pdf/Guia-Proyecto-de-Aula.docx
@@ -9358,255 +9358,180 @@
     </w:p>
     <w:p>
       <w:pPr>
-        <w:spacing w:before="120" w:after="120" w:line="276" w:lineRule="auto"/>
-        <w:ind w:left="120"/>
-        <w:shd w:val="clear" w:color="auto" w:fill="E9F7EF"/>
-      </w:pPr>
+        <w:spacing w:after="120" w:line="276" w:lineRule="auto"/>
+        <w:ind w:left="454" w:hanging="284"/>
+      </w:pPr>
+      <w:r>
+        <w:rPr>
+          <w:rFonts w:ascii="Times New Roman" w:hAnsi="Times New Roman" w:cs="Times New Roman"/>
+          <w:color w:val="000000"/>
+          <w:sz w:val="22"/>
+          <w:szCs w:val="22"/>
+        </w:rPr>
+        <w:t xml:space="preserve">•	</w:t>
+      </w:r>
       <w:r>
         <w:rPr>
           <w:rFonts w:ascii="Times New Roman" w:hAnsi="Times New Roman" w:cs="Times New Roman"/>
           <w:b/>
           <w:color w:val="000000"/>
-          <w:sz w:val="21"/>
-          <w:szCs w:val="21"/>
-        </w:rPr>
-        <w:t xml:space="preserve">Cuidado:</w:t>
-      </w:r>
-      <w:r>
-        <w:rPr>
-          <w:rFonts w:ascii="Times New Roman" w:hAnsi="Times New Roman" w:cs="Times New Roman"/>
-          <w:color w:val="000000"/>
-          <w:sz w:val="21"/>
-          <w:szCs w:val="21"/>
-        </w:rPr>
-        <w:t xml:space="preserve"> </w:t>
+          <w:sz w:val="22"/>
+          <w:szCs w:val="22"/>
+        </w:rPr>
+        <w:t xml:space="preserve">Elegir el patrón moderno por moda.</w:t>
+      </w:r>
+      <w:r>
+        <w:rPr>
+          <w:rFonts w:ascii="Times New Roman" w:hAnsi="Times New Roman" w:cs="Times New Roman"/>
+          <w:color w:val="000000"/>
+          <w:sz w:val="22"/>
+          <w:szCs w:val="22"/>
+        </w:rPr>
+        <w:t xml:space="preserve"> «Microservicios porque es lo que usan las grandes» no es un argumento. El argumento sale de los atributos de calidad de tu reto y de los límites que mostró tu v1.</w:t>
+      </w:r>
+    </w:p>
+    <w:p>
+      <w:pPr>
+        <w:spacing w:after="120" w:line="276" w:lineRule="auto"/>
+        <w:ind w:left="454" w:hanging="284"/>
+      </w:pPr>
+      <w:r>
+        <w:rPr>
+          <w:rFonts w:ascii="Times New Roman" w:hAnsi="Times New Roman" w:cs="Times New Roman"/>
+          <w:color w:val="000000"/>
+          <w:sz w:val="22"/>
+          <w:szCs w:val="22"/>
+        </w:rPr>
+        <w:t xml:space="preserve">•	</w:t>
       </w:r>
       <w:r>
         <w:rPr>
           <w:rFonts w:ascii="Times New Roman" w:hAnsi="Times New Roman" w:cs="Times New Roman"/>
           <w:b/>
           <w:color w:val="000000"/>
-          <w:sz w:val="21"/>
-          <w:szCs w:val="21"/>
-        </w:rPr>
-        <w:t xml:space="preserve">Elegir el patrón moderno por moda.</w:t>
-      </w:r>
-      <w:r>
-        <w:rPr>
-          <w:rFonts w:ascii="Times New Roman" w:hAnsi="Times New Roman" w:cs="Times New Roman"/>
-          <w:color w:val="000000"/>
-          <w:sz w:val="21"/>
-          <w:szCs w:val="21"/>
-        </w:rPr>
-        <w:t xml:space="preserve"> «Microservicios porque es lo que usan las grandes» no es un argumento. El argumento sale de los atributos de calidad de tu reto y de los límites que mostró tu v1.</w:t>
-      </w:r>
-    </w:p>
-    <w:p>
-      <w:pPr>
-        <w:spacing w:after="80" w:line="276" w:lineRule="auto"/>
-      </w:pPr>
-    </w:p>
-    <w:p>
-      <w:pPr>
-        <w:spacing w:before="120" w:after="120" w:line="276" w:lineRule="auto"/>
-        <w:ind w:left="120"/>
-        <w:shd w:val="clear" w:color="auto" w:fill="E9F7EF"/>
-      </w:pPr>
+          <w:sz w:val="22"/>
+          <w:szCs w:val="22"/>
+        </w:rPr>
+        <w:t xml:space="preserve">Comparar contra un sistema imaginario.</w:t>
+      </w:r>
+      <w:r>
+        <w:rPr>
+          <w:rFonts w:ascii="Times New Roman" w:hAnsi="Times New Roman" w:cs="Times New Roman"/>
+          <w:color w:val="000000"/>
+          <w:sz w:val="22"/>
+          <w:szCs w:val="22"/>
+        </w:rPr>
+        <w:t xml:space="preserve"> La comparación es contra </w:t>
+      </w:r>
       <w:r>
         <w:rPr>
           <w:rFonts w:ascii="Times New Roman" w:hAnsi="Times New Roman" w:cs="Times New Roman"/>
           <w:b/>
           <w:color w:val="000000"/>
-          <w:sz w:val="21"/>
-          <w:szCs w:val="21"/>
-        </w:rPr>
-        <w:t xml:space="preserve">Cuidado:</w:t>
-      </w:r>
-      <w:r>
-        <w:rPr>
-          <w:rFonts w:ascii="Times New Roman" w:hAnsi="Times New Roman" w:cs="Times New Roman"/>
-          <w:color w:val="000000"/>
-          <w:sz w:val="21"/>
-          <w:szCs w:val="21"/>
-        </w:rPr>
-        <w:t xml:space="preserve"> </w:t>
+          <w:sz w:val="22"/>
+          <w:szCs w:val="22"/>
+        </w:rPr>
+        <w:t xml:space="preserve">tu</w:t>
+      </w:r>
+      <w:r>
+        <w:rPr>
+          <w:rFonts w:ascii="Times New Roman" w:hAnsi="Times New Roman" w:cs="Times New Roman"/>
+          <w:color w:val="000000"/>
+          <w:sz w:val="22"/>
+          <w:szCs w:val="22"/>
+        </w:rPr>
+        <w:t xml:space="preserve"> v1, que existe y se puede ejecutar. Si la v1 no corre, no hay comparación.</w:t>
+      </w:r>
+    </w:p>
+    <w:p>
+      <w:pPr>
+        <w:spacing w:after="120" w:line="276" w:lineRule="auto"/>
+        <w:ind w:left="454" w:hanging="284"/>
+      </w:pPr>
+      <w:r>
+        <w:rPr>
+          <w:rFonts w:ascii="Times New Roman" w:hAnsi="Times New Roman" w:cs="Times New Roman"/>
+          <w:color w:val="000000"/>
+          <w:sz w:val="22"/>
+          <w:szCs w:val="22"/>
+        </w:rPr>
+        <w:t xml:space="preserve">•	</w:t>
       </w:r>
       <w:r>
         <w:rPr>
           <w:rFonts w:ascii="Times New Roman" w:hAnsi="Times New Roman" w:cs="Times New Roman"/>
           <w:b/>
           <w:color w:val="000000"/>
-          <w:sz w:val="21"/>
-          <w:szCs w:val="21"/>
-        </w:rPr>
-        <w:t xml:space="preserve">Comparar contra un sistema imaginario.</w:t>
-      </w:r>
-      <w:r>
-        <w:rPr>
-          <w:rFonts w:ascii="Times New Roman" w:hAnsi="Times New Roman" w:cs="Times New Roman"/>
-          <w:color w:val="000000"/>
-          <w:sz w:val="21"/>
-          <w:szCs w:val="21"/>
-        </w:rPr>
-        <w:t xml:space="preserve"> La comparación es contra </w:t>
+          <w:sz w:val="22"/>
+          <w:szCs w:val="22"/>
+        </w:rPr>
+        <w:t xml:space="preserve">Un FO-IV-159 con las instrucciones todavía puestas.</w:t>
+      </w:r>
+      <w:r>
+        <w:rPr>
+          <w:rFonts w:ascii="Times New Roman" w:hAnsi="Times New Roman" w:cs="Times New Roman"/>
+          <w:color w:val="000000"/>
+          <w:sz w:val="22"/>
+          <w:szCs w:val="22"/>
+        </w:rPr>
+        <w:t xml:space="preserve"> Cada campo trae su instrucción en la celda de la derecha: se reemplaza por el texto del equipo, no se deja.</w:t>
+      </w:r>
+    </w:p>
+    <w:p>
+      <w:pPr>
+        <w:spacing w:after="120" w:line="276" w:lineRule="auto"/>
+        <w:ind w:left="454" w:hanging="284"/>
+      </w:pPr>
+      <w:r>
+        <w:rPr>
+          <w:rFonts w:ascii="Times New Roman" w:hAnsi="Times New Roman" w:cs="Times New Roman"/>
+          <w:color w:val="000000"/>
+          <w:sz w:val="22"/>
+          <w:szCs w:val="22"/>
+        </w:rPr>
+        <w:t xml:space="preserve">•	</w:t>
       </w:r>
       <w:r>
         <w:rPr>
           <w:rFonts w:ascii="Times New Roman" w:hAnsi="Times New Roman" w:cs="Times New Roman"/>
           <w:b/>
           <w:color w:val="000000"/>
-          <w:sz w:val="21"/>
-          <w:szCs w:val="21"/>
-        </w:rPr>
-        <w:t xml:space="preserve">tu</w:t>
-      </w:r>
-      <w:r>
-        <w:rPr>
-          <w:rFonts w:ascii="Times New Roman" w:hAnsi="Times New Roman" w:cs="Times New Roman"/>
-          <w:color w:val="000000"/>
-          <w:sz w:val="21"/>
-          <w:szCs w:val="21"/>
-        </w:rPr>
-        <w:t xml:space="preserve"> v1, que existe y se puede ejecutar. Si la v1 no corre, no hay comparación.</w:t>
-      </w:r>
-    </w:p>
-    <w:p>
-      <w:pPr>
-        <w:spacing w:after="80" w:line="276" w:lineRule="auto"/>
-      </w:pPr>
-    </w:p>
-    <w:p>
-      <w:pPr>
-        <w:spacing w:before="120" w:after="120" w:line="276" w:lineRule="auto"/>
-        <w:ind w:left="120"/>
-        <w:shd w:val="clear" w:color="auto" w:fill="E9F7EF"/>
-      </w:pPr>
+          <w:sz w:val="22"/>
+          <w:szCs w:val="22"/>
+        </w:rPr>
+        <w:t xml:space="preserve">Juicios de valor en el planteamiento.</w:t>
+      </w:r>
+      <w:r>
+        <w:rPr>
+          <w:rFonts w:ascii="Times New Roman" w:hAnsi="Times New Roman" w:cs="Times New Roman"/>
+          <w:color w:val="000000"/>
+          <w:sz w:val="22"/>
+          <w:szCs w:val="22"/>
+        </w:rPr>
+        <w:t xml:space="preserve"> El formato pide evitar «bueno», «malo», «mejor», «peor»: usa datos y fuentes.</w:t>
+      </w:r>
+    </w:p>
+    <w:p>
+      <w:pPr>
+        <w:spacing w:after="120" w:line="276" w:lineRule="auto"/>
+        <w:ind w:left="454" w:hanging="284"/>
+      </w:pPr>
+      <w:r>
+        <w:rPr>
+          <w:rFonts w:ascii="Times New Roman" w:hAnsi="Times New Roman" w:cs="Times New Roman"/>
+          <w:color w:val="000000"/>
+          <w:sz w:val="22"/>
+          <w:szCs w:val="22"/>
+        </w:rPr>
+        <w:t xml:space="preserve">•	</w:t>
+      </w:r>
       <w:r>
         <w:rPr>
           <w:rFonts w:ascii="Times New Roman" w:hAnsi="Times New Roman" w:cs="Times New Roman"/>
           <w:b/>
           <w:color w:val="000000"/>
-          <w:sz w:val="21"/>
-          <w:szCs w:val="21"/>
-        </w:rPr>
-        <w:t xml:space="preserve">Cuidado:</w:t>
-      </w:r>
-      <w:r>
-        <w:rPr>
-          <w:rFonts w:ascii="Times New Roman" w:hAnsi="Times New Roman" w:cs="Times New Roman"/>
-          <w:color w:val="000000"/>
-          <w:sz w:val="21"/>
-          <w:szCs w:val="21"/>
-        </w:rPr>
-        <w:t xml:space="preserve"> </w:t>
-      </w:r>
-      <w:r>
-        <w:rPr>
-          <w:rFonts w:ascii="Times New Roman" w:hAnsi="Times New Roman" w:cs="Times New Roman"/>
-          <w:b/>
-          <w:color w:val="000000"/>
-          <w:sz w:val="21"/>
-          <w:szCs w:val="21"/>
-        </w:rPr>
-        <w:t xml:space="preserve">Un FO-IV-159 con las instrucciones todavía puestas.</w:t>
-      </w:r>
-      <w:r>
-        <w:rPr>
-          <w:rFonts w:ascii="Times New Roman" w:hAnsi="Times New Roman" w:cs="Times New Roman"/>
-          <w:color w:val="000000"/>
-          <w:sz w:val="21"/>
-          <w:szCs w:val="21"/>
-        </w:rPr>
-        <w:t xml:space="preserve"> Cada campo trae su instrucción en la celda de la derecha: se reemplaza por el texto del equipo, no se deja.</w:t>
-      </w:r>
-    </w:p>
-    <w:p>
-      <w:pPr>
-        <w:spacing w:after="80" w:line="276" w:lineRule="auto"/>
-      </w:pPr>
-    </w:p>
-    <w:p>
-      <w:pPr>
-        <w:spacing w:before="120" w:after="120" w:line="276" w:lineRule="auto"/>
-        <w:ind w:left="120"/>
-        <w:shd w:val="clear" w:color="auto" w:fill="E9F7EF"/>
-      </w:pPr>
-      <w:r>
-        <w:rPr>
-          <w:rFonts w:ascii="Times New Roman" w:hAnsi="Times New Roman" w:cs="Times New Roman"/>
-          <w:b/>
-          <w:color w:val="000000"/>
-          <w:sz w:val="21"/>
-          <w:szCs w:val="21"/>
-        </w:rPr>
-        <w:t xml:space="preserve">Cuidado:</w:t>
-      </w:r>
-      <w:r>
-        <w:rPr>
-          <w:rFonts w:ascii="Times New Roman" w:hAnsi="Times New Roman" w:cs="Times New Roman"/>
-          <w:color w:val="000000"/>
-          <w:sz w:val="21"/>
-          <w:szCs w:val="21"/>
-        </w:rPr>
-        <w:t xml:space="preserve"> </w:t>
-      </w:r>
-      <w:r>
-        <w:rPr>
-          <w:rFonts w:ascii="Times New Roman" w:hAnsi="Times New Roman" w:cs="Times New Roman"/>
-          <w:b/>
-          <w:color w:val="000000"/>
-          <w:sz w:val="21"/>
-          <w:szCs w:val="21"/>
-        </w:rPr>
-        <w:t xml:space="preserve">Juicios de valor en el planteamiento.</w:t>
-      </w:r>
-      <w:r>
-        <w:rPr>
-          <w:rFonts w:ascii="Times New Roman" w:hAnsi="Times New Roman" w:cs="Times New Roman"/>
-          <w:color w:val="000000"/>
-          <w:sz w:val="21"/>
-          <w:szCs w:val="21"/>
-        </w:rPr>
-        <w:t xml:space="preserve"> El formato pide evitar «bueno», «malo», «mejor», «peor»: usa datos y fuentes.</w:t>
-      </w:r>
-    </w:p>
-    <w:p>
-      <w:pPr>
-        <w:spacing w:after="80" w:line="276" w:lineRule="auto"/>
-      </w:pPr>
-    </w:p>
-    <w:p>
-      <w:pPr>
-        <w:spacing w:before="120" w:after="120" w:line="276" w:lineRule="auto"/>
-        <w:ind w:left="120"/>
-        <w:shd w:val="clear" w:color="auto" w:fill="E9F7EF"/>
-      </w:pPr>
-      <w:r>
-        <w:rPr>
-          <w:rFonts w:ascii="Times New Roman" w:hAnsi="Times New Roman" w:cs="Times New Roman"/>
-          <w:b/>
-          <w:color w:val="000000"/>
-          <w:sz w:val="21"/>
-          <w:szCs w:val="21"/>
-        </w:rPr>
-        <w:t xml:space="preserve">Cuidado:</w:t>
-      </w:r>
-      <w:r>
-        <w:rPr>
-          <w:rFonts w:ascii="Times New Roman" w:hAnsi="Times New Roman" w:cs="Times New Roman"/>
-          <w:color w:val="000000"/>
-          <w:sz w:val="21"/>
-          <w:szCs w:val="21"/>
-        </w:rPr>
-        <w:t xml:space="preserve"> </w:t>
-      </w:r>
-      <w:r>
-        <w:rPr>
-          <w:rFonts w:ascii="Times New Roman" w:hAnsi="Times New Roman" w:cs="Times New Roman"/>
-          <w:b/>
-          <w:color w:val="000000"/>
-          <w:sz w:val="21"/>
-          <w:szCs w:val="21"/>
+          <w:sz w:val="22"/>
+          <w:szCs w:val="22"/>
         </w:rPr>
         <w:t xml:space="preserve">Empezar la v2 borrando la v1.</w:t>
       </w:r>
@@ -9614,8 +9539,8 @@
         <w:rPr>
           <w:rFonts w:ascii="Times New Roman" w:hAnsi="Times New Roman" w:cs="Times New Roman"/>
           <w:color w:val="000000"/>
-          <w:sz w:val="21"/>
-          <w:szCs w:val="21"/>
+          <w:sz w:val="22"/>
+          <w:szCs w:val="22"/>
         </w:rPr>
         <w:t xml:space="preserve"> Etiqueta la v1 en git antes de tocarla.</w:t>
       </w:r>

</xml_diff>